<commit_message>
Updated the report + changed src repository name to sourcecode
</commit_message>
<xml_diff>
--- a/report/OOPCapstoneProject-TetrisGame.docx
+++ b/report/OOPCapstoneProject-TetrisGame.docx
@@ -831,6 +831,121 @@
               <w:t xml:space="preserve">Main</w:t>
             </w:r>
           </w:p>
+          <w:p>
+            <w:pPr>
+              <w:widowControl w:val="0"/>
+              <w:numPr>
+                <w:ilvl w:val="0"/>
+                <w:numId w:val="5"/>
+              </w:numPr>
+              <w:spacing w:after="0" w:afterAutospacing="0" w:line="240" w:lineRule="auto"/>
+              <w:ind w:left="720" w:hanging="360"/>
+              <w:jc w:val="both"/>
+              <w:rPr>
+                <w:rFonts w:ascii="Times New Roman" w:cs="Times New Roman" w:eastAsia="Times New Roman" w:hAnsi="Times New Roman"/>
+              </w:rPr>
+            </w:pPr>
+            <w:r>
+              <w:rPr>
+                <w:rFonts w:ascii="Times New Roman" w:cs="Times New Roman" w:eastAsia="Times New Roman" w:hAnsi="Times New Roman"/>
+                <w:rtl w:val="0"/>
+              </w:rPr>
+              <w:t xml:space="preserve">GameLoopController</w:t>
+            </w:r>
+          </w:p>
+          <w:p>
+            <w:pPr>
+              <w:widowControl w:val="0"/>
+              <w:numPr>
+                <w:ilvl w:val="0"/>
+                <w:numId w:val="5"/>
+              </w:numPr>
+              <w:spacing w:after="0" w:afterAutospacing="0" w:line="240" w:lineRule="auto"/>
+              <w:ind w:left="720" w:hanging="360"/>
+              <w:jc w:val="both"/>
+              <w:rPr>
+                <w:rFonts w:ascii="Times New Roman" w:cs="Times New Roman" w:eastAsia="Times New Roman" w:hAnsi="Times New Roman"/>
+              </w:rPr>
+            </w:pPr>
+            <w:r>
+              <w:rPr>
+                <w:rFonts w:ascii="Times New Roman" w:cs="Times New Roman" w:eastAsia="Times New Roman" w:hAnsi="Times New Roman"/>
+                <w:rtl w:val="0"/>
+              </w:rPr>
+              <w:t xml:space="preserve">PieceMovementController</w:t>
+            </w:r>
+          </w:p>
+          <w:p>
+            <w:pPr>
+              <w:widowControl w:val="0"/>
+              <w:numPr>
+                <w:ilvl w:val="0"/>
+                <w:numId w:val="5"/>
+              </w:numPr>
+              <w:spacing w:after="0" w:afterAutospacing="0" w:line="240" w:lineRule="auto"/>
+              <w:ind w:left="720" w:hanging="360"/>
+              <w:jc w:val="both"/>
+              <w:rPr>
+                <w:rFonts w:ascii="Times New Roman" w:cs="Times New Roman" w:eastAsia="Times New Roman" w:hAnsi="Times New Roman"/>
+              </w:rPr>
+            </w:pPr>
+            <w:r>
+              <w:rPr>
+                <w:rFonts w:ascii="Times New Roman" w:cs="Times New Roman" w:eastAsia="Times New Roman" w:hAnsi="Times New Roman"/>
+                <w:rtl w:val="0"/>
+              </w:rPr>
+              <w:t xml:space="preserve">PieceQueue</w:t>
+            </w:r>
+          </w:p>
+          <w:p>
+            <w:pPr>
+              <w:widowControl w:val="0"/>
+              <w:numPr>
+                <w:ilvl w:val="0"/>
+                <w:numId w:val="5"/>
+              </w:numPr>
+              <w:spacing w:after="160" w:line="240" w:lineRule="auto"/>
+              <w:ind w:left="720" w:hanging="360"/>
+              <w:jc w:val="both"/>
+              <w:rPr>
+                <w:rFonts w:ascii="Times New Roman" w:cs="Times New Roman" w:eastAsia="Times New Roman" w:hAnsi="Times New Roman"/>
+              </w:rPr>
+            </w:pPr>
+            <w:r>
+              <w:rPr>
+                <w:rFonts w:ascii="Times New Roman" w:cs="Times New Roman" w:eastAsia="Times New Roman" w:hAnsi="Times New Roman"/>
+                <w:rtl w:val="0"/>
+              </w:rPr>
+              <w:t xml:space="preserve">ScoreManager</w:t>
+            </w:r>
+          </w:p>
+          <w:p>
+            <w:pPr>
+              <w:keepNext w:val="0"/>
+              <w:keepLines w:val="0"/>
+              <w:pageBreakBefore w:val="0"/>
+              <w:widowControl w:val="0"/>
+              <w:pBdr>
+                <w:top w:space="0" w:sz="0" w:val="nil"/>
+                <w:left w:space="0" w:sz="0" w:val="nil"/>
+                <w:bottom w:space="0" w:sz="0" w:val="nil"/>
+                <w:right w:space="0" w:sz="0" w:val="nil"/>
+                <w:between w:space="0" w:sz="0" w:val="nil"/>
+              </w:pBdr>
+              <w:shd w:fill="auto" w:val="clear"/>
+              <w:spacing w:after="0" w:before="0" w:line="240" w:lineRule="auto"/>
+              <w:ind w:left="0" w:right="0" w:firstLine="0"/>
+              <w:jc w:val="both"/>
+              <w:rPr>
+                <w:rFonts w:ascii="Times New Roman" w:cs="Times New Roman" w:eastAsia="Times New Roman" w:hAnsi="Times New Roman"/>
+              </w:rPr>
+            </w:pPr>
+            <w:r>
+              <w:rPr>
+                <w:rtl w:val="0"/>
+              </w:rPr>
+            </w:r>
+          </w:p>
         </w:tc>
         <w:tc>
           <w:tcPr>
@@ -1006,13 +1121,41 @@
               <w:widowControl w:val="0"/>
               <w:numPr>
                 <w:ilvl w:val="0"/>
-                <w:numId w:val="3"/>
+                <w:numId w:val="8"/>
               </w:numPr>
               <w:spacing w:line="240" w:lineRule="auto"/>
               <w:ind w:left="720" w:hanging="360"/>
               <w:jc w:val="both"/>
               <w:rPr>
                 <w:rFonts w:ascii="Times New Roman" w:cs="Times New Roman" w:eastAsia="Times New Roman" w:hAnsi="Times New Roman"/>
+                <w:sz w:val="24"/>
+                <w:szCs w:val="24"/>
+                <w:u w:val="none"/>
+              </w:rPr>
+            </w:pPr>
+            <w:r>
+              <w:rPr>
+                <w:rFonts w:ascii="Times New Roman" w:cs="Times New Roman" w:eastAsia="Times New Roman" w:hAnsi="Times New Roman"/>
+                <w:sz w:val="24"/>
+                <w:szCs w:val="24"/>
+                <w:rtl w:val="0"/>
+              </w:rPr>
+              <w:t xml:space="preserve">SoundController</w:t>
+            </w:r>
+          </w:p>
+          <w:p>
+            <w:pPr>
+              <w:widowControl w:val="0"/>
+              <w:numPr>
+                <w:ilvl w:val="0"/>
+                <w:numId w:val="8"/>
+              </w:numPr>
+              <w:spacing w:line="240" w:lineRule="auto"/>
+              <w:ind w:left="720" w:hanging="360"/>
+              <w:jc w:val="both"/>
+              <w:rPr>
+                <w:rFonts w:ascii="Times New Roman" w:cs="Times New Roman" w:eastAsia="Times New Roman" w:hAnsi="Times New Roman"/>
+                <w:u w:val="none"/>
               </w:rPr>
             </w:pPr>
             <w:r>
@@ -1569,6 +1712,38 @@
               <w:jc w:val="both"/>
               <w:rPr>
                 <w:rFonts w:ascii="Times New Roman" w:cs="Times New Roman" w:eastAsia="Times New Roman" w:hAnsi="Times New Roman"/>
+                <w:u w:val="none"/>
+              </w:rPr>
+            </w:pPr>
+            <w:r>
+              <w:rPr>
+                <w:rtl w:val="0"/>
+              </w:rPr>
+            </w:r>
+          </w:p>
+          <w:p>
+            <w:pPr>
+              <w:keepNext w:val="0"/>
+              <w:keepLines w:val="0"/>
+              <w:pageBreakBefore w:val="0"/>
+              <w:widowControl w:val="0"/>
+              <w:numPr>
+                <w:ilvl w:val="0"/>
+                <w:numId w:val="4"/>
+              </w:numPr>
+              <w:pBdr>
+                <w:top w:space="0" w:sz="0" w:val="nil"/>
+                <w:left w:space="0" w:sz="0" w:val="nil"/>
+                <w:bottom w:space="0" w:sz="0" w:val="nil"/>
+                <w:right w:space="0" w:sz="0" w:val="nil"/>
+                <w:between w:space="0" w:sz="0" w:val="nil"/>
+              </w:pBdr>
+              <w:shd w:fill="auto" w:val="clear"/>
+              <w:spacing w:after="0" w:before="0" w:line="240" w:lineRule="auto"/>
+              <w:ind w:left="720" w:right="0" w:hanging="360"/>
+              <w:jc w:val="both"/>
+              <w:rPr>
+                <w:rFonts w:ascii="Times New Roman" w:cs="Times New Roman" w:eastAsia="Times New Roman" w:hAnsi="Times New Roman"/>
               </w:rPr>
             </w:pPr>
             <w:r>
@@ -1841,6 +2016,62 @@
                 <w:rtl w:val="0"/>
               </w:rPr>
               <w:t xml:space="preserve">getUpcomingPieces</w:t>
+            </w:r>
+          </w:p>
+          <w:p>
+            <w:pPr>
+              <w:keepNext w:val="0"/>
+              <w:keepLines w:val="0"/>
+              <w:pageBreakBefore w:val="0"/>
+              <w:widowControl w:val="0"/>
+              <w:pBdr>
+                <w:top w:space="0" w:sz="0" w:val="nil"/>
+                <w:left w:space="0" w:sz="0" w:val="nil"/>
+                <w:bottom w:space="0" w:sz="0" w:val="nil"/>
+                <w:right w:space="0" w:sz="0" w:val="nil"/>
+                <w:between w:space="0" w:sz="0" w:val="nil"/>
+              </w:pBdr>
+              <w:shd w:fill="auto" w:val="clear"/>
+              <w:spacing w:after="0" w:before="0" w:line="240" w:lineRule="auto"/>
+              <w:ind w:left="0" w:right="0" w:firstLine="0"/>
+              <w:jc w:val="both"/>
+              <w:rPr>
+                <w:rFonts w:ascii="Times New Roman" w:cs="Times New Roman" w:eastAsia="Times New Roman" w:hAnsi="Times New Roman"/>
+              </w:rPr>
+            </w:pPr>
+            <w:r>
+              <w:rPr>
+                <w:rFonts w:ascii="Times New Roman" w:cs="Times New Roman" w:eastAsia="Times New Roman" w:hAnsi="Times New Roman"/>
+                <w:rtl w:val="0"/>
+              </w:rPr>
+              <w:t xml:space="preserve">-Design: Modified Class Diagram</w:t>
+            </w:r>
+          </w:p>
+          <w:p>
+            <w:pPr>
+              <w:keepNext w:val="0"/>
+              <w:keepLines w:val="0"/>
+              <w:pageBreakBefore w:val="0"/>
+              <w:widowControl w:val="0"/>
+              <w:pBdr>
+                <w:top w:space="0" w:sz="0" w:val="nil"/>
+                <w:left w:space="0" w:sz="0" w:val="nil"/>
+                <w:bottom w:space="0" w:sz="0" w:val="nil"/>
+                <w:right w:space="0" w:sz="0" w:val="nil"/>
+                <w:between w:space="0" w:sz="0" w:val="nil"/>
+              </w:pBdr>
+              <w:shd w:fill="auto" w:val="clear"/>
+              <w:spacing w:after="0" w:before="0" w:line="240" w:lineRule="auto"/>
+              <w:ind w:left="0" w:right="0" w:firstLine="0"/>
+              <w:jc w:val="both"/>
+              <w:rPr>
+                <w:rFonts w:ascii="Times New Roman" w:cs="Times New Roman" w:eastAsia="Times New Roman" w:hAnsi="Times New Roman"/>
+              </w:rPr>
+            </w:pPr>
+            <w:r>
+              <w:rPr>
+                <w:rtl w:val="0"/>
+              </w:rPr>
             </w:r>
           </w:p>
         </w:tc>
@@ -3143,6 +3374,102 @@
     </w:p>
     <w:p>
       <w:pPr>
+        <w:ind w:left="0" w:firstLine="0"/>
+        <w:jc w:val="both"/>
+        <w:rPr>
+          <w:rFonts w:ascii="Times New Roman" w:cs="Times New Roman" w:eastAsia="Times New Roman" w:hAnsi="Times New Roman"/>
+          <w:sz w:val="26"/>
+          <w:szCs w:val="26"/>
+        </w:rPr>
+      </w:pPr>
+      <w:r>
+        <w:rPr>
+          <w:rtl w:val="0"/>
+        </w:rPr>
+      </w:r>
+    </w:p>
+    <w:p>
+      <w:pPr>
+        <w:ind w:left="0" w:firstLine="0"/>
+        <w:jc w:val="both"/>
+        <w:rPr>
+          <w:rFonts w:ascii="Times New Roman" w:cs="Times New Roman" w:eastAsia="Times New Roman" w:hAnsi="Times New Roman"/>
+          <w:sz w:val="26"/>
+          <w:szCs w:val="26"/>
+        </w:rPr>
+      </w:pPr>
+      <w:r>
+        <w:rPr>
+          <w:rtl w:val="0"/>
+        </w:rPr>
+      </w:r>
+    </w:p>
+    <w:p>
+      <w:pPr>
+        <w:ind w:left="0" w:firstLine="0"/>
+        <w:jc w:val="both"/>
+        <w:rPr>
+          <w:rFonts w:ascii="Times New Roman" w:cs="Times New Roman" w:eastAsia="Times New Roman" w:hAnsi="Times New Roman"/>
+          <w:sz w:val="26"/>
+          <w:szCs w:val="26"/>
+        </w:rPr>
+      </w:pPr>
+      <w:r>
+        <w:rPr>
+          <w:rtl w:val="0"/>
+        </w:rPr>
+      </w:r>
+    </w:p>
+    <w:p>
+      <w:pPr>
+        <w:ind w:left="0" w:firstLine="0"/>
+        <w:jc w:val="both"/>
+        <w:rPr>
+          <w:rFonts w:ascii="Times New Roman" w:cs="Times New Roman" w:eastAsia="Times New Roman" w:hAnsi="Times New Roman"/>
+          <w:sz w:val="26"/>
+          <w:szCs w:val="26"/>
+        </w:rPr>
+      </w:pPr>
+      <w:r>
+        <w:rPr>
+          <w:rtl w:val="0"/>
+        </w:rPr>
+      </w:r>
+    </w:p>
+    <w:p>
+      <w:pPr>
+        <w:ind w:left="0" w:firstLine="0"/>
+        <w:jc w:val="both"/>
+        <w:rPr>
+          <w:rFonts w:ascii="Times New Roman" w:cs="Times New Roman" w:eastAsia="Times New Roman" w:hAnsi="Times New Roman"/>
+          <w:sz w:val="26"/>
+          <w:szCs w:val="26"/>
+        </w:rPr>
+      </w:pPr>
+      <w:r>
+        <w:rPr>
+          <w:rtl w:val="0"/>
+        </w:rPr>
+      </w:r>
+    </w:p>
+    <w:p>
+      <w:pPr>
+        <w:ind w:left="0" w:firstLine="0"/>
+        <w:jc w:val="both"/>
+        <w:rPr>
+          <w:rFonts w:ascii="Times New Roman" w:cs="Times New Roman" w:eastAsia="Times New Roman" w:hAnsi="Times New Roman"/>
+          <w:sz w:val="26"/>
+          <w:szCs w:val="26"/>
+        </w:rPr>
+      </w:pPr>
+      <w:r>
+        <w:rPr>
+          <w:rtl w:val="0"/>
+        </w:rPr>
+      </w:r>
+    </w:p>
+    <w:p>
+      <w:pPr>
         <w:numPr>
           <w:ilvl w:val="0"/>
           <w:numId w:val="2"/>
@@ -3281,22 +3608,6 @@
     </w:p>
     <w:p>
       <w:pPr>
-        <w:ind w:firstLine="720"/>
-        <w:jc w:val="both"/>
-        <w:rPr>
-          <w:rFonts w:ascii="Times New Roman" w:cs="Times New Roman" w:eastAsia="Times New Roman" w:hAnsi="Times New Roman"/>
-          <w:sz w:val="26"/>
-          <w:szCs w:val="26"/>
-        </w:rPr>
-      </w:pPr>
-      <w:r>
-        <w:rPr>
-          <w:rtl w:val="0"/>
-        </w:rPr>
-      </w:r>
-    </w:p>
-    <w:p>
-      <w:pPr>
         <w:numPr>
           <w:ilvl w:val="1"/>
           <w:numId w:val="2"/>
@@ -3348,12 +3659,12 @@
           <wp:inline distB="114300" distT="114300" distL="114300" distR="114300">
             <wp:extent cx="4062413" cy="2484685"/>
             <wp:effectExtent b="0" l="0" r="0" t="0"/>
-            <wp:docPr id="5" name="image5.png"/>
+            <wp:docPr id="5" name="image4.png"/>
             <a:graphic>
               <a:graphicData uri="http://schemas.openxmlformats.org/drawingml/2006/picture">
                 <pic:pic>
                   <pic:nvPicPr>
-                    <pic:cNvPr id="0" name="image5.png"/>
+                    <pic:cNvPr id="0" name="image4.png"/>
                     <pic:cNvPicPr preferRelativeResize="0"/>
                   </pic:nvPicPr>
                   <pic:blipFill>
@@ -3501,6 +3812,54 @@
     </w:p>
     <w:p>
       <w:pPr>
+        <w:ind w:left="0" w:firstLine="720"/>
+        <w:jc w:val="both"/>
+        <w:rPr>
+          <w:rFonts w:ascii="Times New Roman" w:cs="Times New Roman" w:eastAsia="Times New Roman" w:hAnsi="Times New Roman"/>
+          <w:sz w:val="26"/>
+          <w:szCs w:val="26"/>
+        </w:rPr>
+      </w:pPr>
+      <w:r>
+        <w:rPr>
+          <w:rtl w:val="0"/>
+        </w:rPr>
+      </w:r>
+    </w:p>
+    <w:p>
+      <w:pPr>
+        <w:ind w:left="0" w:firstLine="0"/>
+        <w:jc w:val="both"/>
+        <w:rPr>
+          <w:rFonts w:ascii="Times New Roman" w:cs="Times New Roman" w:eastAsia="Times New Roman" w:hAnsi="Times New Roman"/>
+          <w:sz w:val="26"/>
+          <w:szCs w:val="26"/>
+        </w:rPr>
+      </w:pPr>
+      <w:r>
+        <w:rPr>
+          <w:rtl w:val="0"/>
+        </w:rPr>
+      </w:r>
+    </w:p>
+    <w:p>
+      <w:pPr>
+        <w:ind w:left="0" w:firstLine="0"/>
+        <w:jc w:val="both"/>
+        <w:rPr>
+          <w:rFonts w:ascii="Times New Roman" w:cs="Times New Roman" w:eastAsia="Times New Roman" w:hAnsi="Times New Roman"/>
+          <w:sz w:val="26"/>
+          <w:szCs w:val="26"/>
+        </w:rPr>
+      </w:pPr>
+      <w:r>
+        <w:rPr>
+          <w:rtl w:val="0"/>
+        </w:rPr>
+      </w:r>
+    </w:p>
+    <w:p>
+      <w:pPr>
         <w:ind w:left="0" w:firstLine="0"/>
         <w:jc w:val="both"/>
         <w:rPr>
@@ -3576,7 +3935,7 @@
     <w:p>
       <w:pPr>
         <w:ind w:left="0" w:firstLine="0"/>
-        <w:jc w:val="center"/>
+        <w:jc w:val="both"/>
         <w:rPr>
           <w:rFonts w:ascii="Times New Roman" w:cs="Times New Roman" w:eastAsia="Times New Roman" w:hAnsi="Times New Roman"/>
           <w:b w:val="1"/>
@@ -3595,14 +3954,14 @@
         </w:rPr>
         <w:drawing>
           <wp:inline distB="114300" distT="114300" distL="114300" distR="114300">
-            <wp:extent cx="5253038" cy="2897583"/>
+            <wp:extent cx="5824538" cy="2501564"/>
             <wp:effectExtent b="0" l="0" r="0" t="0"/>
-            <wp:docPr id="1" name="image4.png"/>
+            <wp:docPr id="2" name="image1.png"/>
             <a:graphic>
               <a:graphicData uri="http://schemas.openxmlformats.org/drawingml/2006/picture">
                 <pic:pic>
                   <pic:nvPicPr>
-                    <pic:cNvPr id="0" name="image4.png"/>
+                    <pic:cNvPr id="0" name="image1.png"/>
                     <pic:cNvPicPr preferRelativeResize="0"/>
                   </pic:nvPicPr>
                   <pic:blipFill>
@@ -3615,7 +3974,7 @@
                   <pic:spPr>
                     <a:xfrm>
                       <a:off x="0" y="0"/>
-                      <a:ext cx="5253038" cy="2897583"/>
+                      <a:ext cx="5824538" cy="2501564"/>
                     </a:xfrm>
                     <a:prstGeom prst="rect"/>
                     <a:ln/>
@@ -3671,26 +4030,71 @@
     </w:p>
     <w:p>
       <w:pPr>
-        <w:spacing w:after="240" w:before="180" w:lineRule="auto"/>
-        <w:ind w:left="0" w:firstLine="720"/>
+        <w:ind w:left="0" w:firstLine="0"/>
+        <w:jc w:val="center"/>
+        <w:rPr>
+          <w:rFonts w:ascii="Times New Roman" w:cs="Times New Roman" w:eastAsia="Times New Roman" w:hAnsi="Times New Roman"/>
+          <w:i w:val="1"/>
+          <w:iCs w:val="1"/>
+          <w:sz w:val="26"/>
+          <w:szCs w:val="26"/>
+        </w:rPr>
+      </w:pPr>
+      <w:r>
+        <w:rPr>
+          <w:rtl w:val="0"/>
+        </w:rPr>
+      </w:r>
+    </w:p>
+    <w:p>
+      <w:pPr>
+        <w:spacing w:after="160" w:lineRule="auto"/>
+        <w:ind w:firstLine="720"/>
         <w:jc w:val="both"/>
         <w:rPr>
           <w:rFonts w:ascii="Times New Roman" w:cs="Times New Roman" w:eastAsia="Times New Roman" w:hAnsi="Times New Roman"/>
-          <w:b w:val="1"/>
-          <w:bCs w:val="1"/>
-          <w:sz w:val="26"/>
-          <w:szCs w:val="26"/>
-        </w:rPr>
-      </w:pPr>
-      <w:r>
-        <w:rPr>
-          <w:rFonts w:ascii="Times New Roman" w:cs="Times New Roman" w:eastAsia="Times New Roman" w:hAnsi="Times New Roman"/>
-          <w:sz w:val="26"/>
-          <w:szCs w:val="26"/>
-          <w:rtl w:val="0"/>
-        </w:rPr>
-        <w:t xml:space="preserve">The system is divided into 3 main packages: model, view, and controller. Within this architecture, MainFrame acts as the primary structural container, maintaining a composition relationship over its structural view panels, which include MenuPanel, GamePanel, HelpPanel, and DifficultyPanel. While bidirectional relationships exist between specific sub-panels and the container, explicit X markings on association paths dictate strict unidirectional navigation limits to prevent structural coupling. Finally, polymorphic inheritance links specialized components to JFrame and JPanel base classes, while binding structural shape blocks directly to the base Tetromino abstract type. </w:t>
-      </w:r>
+          <w:sz w:val="26"/>
+          <w:szCs w:val="26"/>
+        </w:rPr>
+      </w:pPr>
+      <w:r>
+        <w:rPr>
+          <w:rFonts w:ascii="Times New Roman" w:cs="Times New Roman" w:eastAsia="Times New Roman" w:hAnsi="Times New Roman"/>
+          <w:sz w:val="26"/>
+          <w:szCs w:val="26"/>
+          <w:rtl w:val="0"/>
+        </w:rPr>
+        <w:t xml:space="preserve">The software architecture of the Tetris application strictly adheres to the Model–View–Controller (MVC) design pattern, organizing the system into three primary packages: model, view, and controller. This separation of concerns ensures that data representation, user interface rendering, and gameplay logic remain modular, loosely coupled, and independently maintainable. At a structural level, the Controller layer, centered around the GameEngine class, functions as the mediator between the View and Model layers. User interactions originating from the graphical interface are forwarded to the controller through direct method invocations (e.g., movement or rotation commands). The controller, in turn, updates the game state within the model and asynchronously notifies the view to refresh its presentation. This update mechanism is implemented through a registered Runnable callback, ensuring that rendering remains reactive while remaining decoupled from core game logic. The View layer does not directly manipulate model data, nor does the Model layer maintain any dependency on user interface components. This unidirectional dependency flow—from View to Controller to Model, and back to View via notification—preserves architectural integrity and prevents cyclic coupling. The General Class Diagram reflects this design by clearly delineating package boundaries, enforcing composition where lifecycle ownership is required, and constraining associations to prevent structural misuse.</w:t>
+      </w:r>
+    </w:p>
+    <w:p>
+      <w:pPr>
+        <w:spacing w:after="160" w:lineRule="auto"/>
+        <w:ind w:firstLine="720"/>
+        <w:jc w:val="both"/>
+        <w:rPr>
+          <w:rFonts w:ascii="Times New Roman" w:cs="Times New Roman" w:eastAsia="Times New Roman" w:hAnsi="Times New Roman"/>
+          <w:sz w:val="26"/>
+          <w:szCs w:val="26"/>
+        </w:rPr>
+      </w:pPr>
+      <w:r>
+        <w:rPr>
+          <w:rtl w:val="0"/>
+        </w:rPr>
+      </w:r>
+    </w:p>
+    <w:p>
+      <w:pPr>
+        <w:spacing w:after="160" w:lineRule="auto"/>
+        <w:ind w:firstLine="720"/>
+        <w:jc w:val="both"/>
+        <w:rPr>
+          <w:rFonts w:ascii="Times New Roman" w:cs="Times New Roman" w:eastAsia="Times New Roman" w:hAnsi="Times New Roman"/>
+          <w:sz w:val="26"/>
+          <w:szCs w:val="26"/>
+        </w:rPr>
+      </w:pPr>
       <w:r>
         <w:rPr>
           <w:rtl w:val="0"/>
@@ -3729,7 +4133,7 @@
     <w:p>
       <w:pPr>
         <w:ind w:left="0" w:firstLine="0"/>
-        <w:jc w:val="center"/>
+        <w:jc w:val="both"/>
         <w:rPr>
           <w:rFonts w:ascii="Times New Roman" w:cs="Times New Roman" w:eastAsia="Times New Roman" w:hAnsi="Times New Roman"/>
           <w:b w:val="1"/>
@@ -3748,9 +4152,9 @@
         </w:rPr>
         <w:drawing>
           <wp:inline distB="114300" distT="114300" distL="114300" distR="114300">
-            <wp:extent cx="4376738" cy="3851184"/>
+            <wp:extent cx="5943600" cy="2108200"/>
             <wp:effectExtent b="0" l="0" r="0" t="0"/>
-            <wp:docPr id="4" name="image3.png"/>
+            <wp:docPr id="1" name="image3.png"/>
             <a:graphic>
               <a:graphicData uri="http://schemas.openxmlformats.org/drawingml/2006/picture">
                 <pic:pic>
@@ -3768,7 +4172,7 @@
                   <pic:spPr>
                     <a:xfrm>
                       <a:off x="0" y="0"/>
-                      <a:ext cx="4376738" cy="3851184"/>
+                      <a:ext cx="5943600" cy="2108200"/>
                     </a:xfrm>
                     <a:prstGeom prst="rect"/>
                     <a:ln/>
@@ -3843,7 +4247,7 @@
     <w:p>
       <w:pPr>
         <w:spacing w:after="160" w:lineRule="auto"/>
-        <w:ind w:left="0" w:firstLine="720"/>
+        <w:ind w:firstLine="720"/>
         <w:jc w:val="both"/>
         <w:rPr>
           <w:rFonts w:ascii="Times New Roman" w:cs="Times New Roman" w:eastAsia="Times New Roman" w:hAnsi="Times New Roman"/>
@@ -3858,17 +4262,101 @@
           <w:szCs w:val="26"/>
           <w:rtl w:val="0"/>
         </w:rPr>
-        <w:t xml:space="preserve">The class diagram within the view package defines the user interface structure of the game application, which is built on the Java Swing and Java AWT libraries. The primary class responsible is MainFrame, which extends JFrame and acts as the main window controlling the entire display flow. MainFrame utilizes Java AWT's CardLayout mechanism to manage and dynamically switch between different interface screens, including MenuPanel, GamePanel, DifficultyPanel, and HelpPanel. These component screens all extend the JPanel class and depend on the Constants class to identify the interface transition flow using string constants such as SCREEN_MENU or SCREEN_GAME. In terms of method execution, the GamePanel class plays the most critical role in handling the game's graphics. This class overrides the paintComponent method to execute the entire screen rendering process through a sequence of specialized internal methods, including drawGrid(), drawActivePiece(), drawLockedBlocks(), and drawGameOverMessage(). These methods interact directly with the Graphics object and data from the Board or Tetromino to display the game state in real time. Additionally, the confirmAndQuit() method in MainFrame is designed to handle application closure events safely, ensuring synchronicity and a consistent user experience across all component screens.</w:t>
+        <w:t xml:space="preserve">The user interface architecture is constructed utilizing the Java Swing and AWT libraries. The MainFrame class extends JFrame and functions as the primary application window. It utilizes a CardLayout manager mapped to a central contentPanel to dynamically manage and switch between four distinct interface panels: MenuPanel, GamePanel, HelpPanel, and DifficultyPanel. To prevent typographic errors and maintain routing consistency, string identifiers defining these layout states are centralized within the Constants class. The graphical rendering and active input processing are predominantly handled by the GamePanel. Graphical rendering is achieved by overriding the paintComponent(Graphics g) method, which sequentially executes specialized drawing subroutines to build the frame. These routines include drawing the background grid, locked blocks, the active falling piece, a calculated drop-shadow piece, the player's score, and the upcoming piece queue. Input handling employs a modernized approach, utilizing Swing's InputMap and ActionMap bindings rather than basic key listeners. This securely binds specific keystrokes (such as the directional arrows, SPACE, and ESCAPE) to AbstractAction objects, which in turn trigger the corresponding behavioral methods within the active GameEngine.</w:t>
       </w:r>
     </w:p>
     <w:p>
       <w:pPr>
-        <w:ind w:left="0" w:firstLine="0"/>
+        <w:spacing w:after="160" w:lineRule="auto"/>
+        <w:ind w:firstLine="720"/>
         <w:jc w:val="both"/>
         <w:rPr>
           <w:rFonts w:ascii="Times New Roman" w:cs="Times New Roman" w:eastAsia="Times New Roman" w:hAnsi="Times New Roman"/>
-          <w:b w:val="1"/>
-          <w:bCs w:val="1"/>
+          <w:sz w:val="26"/>
+          <w:szCs w:val="26"/>
+        </w:rPr>
+      </w:pPr>
+      <w:r>
+        <w:rPr>
+          <w:rtl w:val="0"/>
+        </w:rPr>
+      </w:r>
+    </w:p>
+    <w:p>
+      <w:pPr>
+        <w:spacing w:after="160" w:lineRule="auto"/>
+        <w:ind w:firstLine="720"/>
+        <w:jc w:val="both"/>
+        <w:rPr>
+          <w:rFonts w:ascii="Times New Roman" w:cs="Times New Roman" w:eastAsia="Times New Roman" w:hAnsi="Times New Roman"/>
+          <w:sz w:val="26"/>
+          <w:szCs w:val="26"/>
+        </w:rPr>
+      </w:pPr>
+      <w:r>
+        <w:rPr>
+          <w:rtl w:val="0"/>
+        </w:rPr>
+      </w:r>
+    </w:p>
+    <w:p>
+      <w:pPr>
+        <w:spacing w:after="160" w:lineRule="auto"/>
+        <w:ind w:firstLine="720"/>
+        <w:jc w:val="both"/>
+        <w:rPr>
+          <w:rFonts w:ascii="Times New Roman" w:cs="Times New Roman" w:eastAsia="Times New Roman" w:hAnsi="Times New Roman"/>
+          <w:sz w:val="26"/>
+          <w:szCs w:val="26"/>
+        </w:rPr>
+      </w:pPr>
+      <w:r>
+        <w:rPr>
+          <w:rtl w:val="0"/>
+        </w:rPr>
+      </w:r>
+    </w:p>
+    <w:p>
+      <w:pPr>
+        <w:spacing w:after="160" w:lineRule="auto"/>
+        <w:ind w:firstLine="720"/>
+        <w:jc w:val="both"/>
+        <w:rPr>
+          <w:rFonts w:ascii="Times New Roman" w:cs="Times New Roman" w:eastAsia="Times New Roman" w:hAnsi="Times New Roman"/>
+          <w:sz w:val="26"/>
+          <w:szCs w:val="26"/>
+        </w:rPr>
+      </w:pPr>
+      <w:r>
+        <w:rPr>
+          <w:rtl w:val="0"/>
+        </w:rPr>
+      </w:r>
+    </w:p>
+    <w:p>
+      <w:pPr>
+        <w:spacing w:after="160" w:lineRule="auto"/>
+        <w:ind w:firstLine="720"/>
+        <w:jc w:val="both"/>
+        <w:rPr>
+          <w:rFonts w:ascii="Times New Roman" w:cs="Times New Roman" w:eastAsia="Times New Roman" w:hAnsi="Times New Roman"/>
+          <w:sz w:val="26"/>
+          <w:szCs w:val="26"/>
+        </w:rPr>
+      </w:pPr>
+      <w:r>
+        <w:rPr>
+          <w:rtl w:val="0"/>
+        </w:rPr>
+      </w:r>
+    </w:p>
+    <w:p>
+      <w:pPr>
+        <w:spacing w:after="160" w:lineRule="auto"/>
+        <w:ind w:firstLine="720"/>
+        <w:jc w:val="both"/>
+        <w:rPr>
+          <w:rFonts w:ascii="Times New Roman" w:cs="Times New Roman" w:eastAsia="Times New Roman" w:hAnsi="Times New Roman"/>
           <w:sz w:val="26"/>
           <w:szCs w:val="26"/>
         </w:rPr>
@@ -3930,14 +4418,14 @@
         </w:rPr>
         <w:drawing>
           <wp:inline distB="114300" distT="114300" distL="114300" distR="114300">
-            <wp:extent cx="4629150" cy="2309532"/>
+            <wp:extent cx="5943600" cy="4152900"/>
             <wp:effectExtent b="0" l="0" r="0" t="0"/>
-            <wp:docPr id="3" name="image2.png"/>
+            <wp:docPr id="4" name="image5.png"/>
             <a:graphic>
               <a:graphicData uri="http://schemas.openxmlformats.org/drawingml/2006/picture">
                 <pic:pic>
                   <pic:nvPicPr>
-                    <pic:cNvPr id="0" name="image2.png"/>
+                    <pic:cNvPr id="0" name="image5.png"/>
                     <pic:cNvPicPr preferRelativeResize="0"/>
                   </pic:nvPicPr>
                   <pic:blipFill>
@@ -3950,7 +4438,7 @@
                   <pic:spPr>
                     <a:xfrm>
                       <a:off x="0" y="0"/>
-                      <a:ext cx="4629150" cy="2309532"/>
+                      <a:ext cx="5943600" cy="4152900"/>
                     </a:xfrm>
                     <a:prstGeom prst="rect"/>
                     <a:ln/>
@@ -4025,44 +4513,7 @@
     <w:p>
       <w:pPr>
         <w:spacing w:after="160" w:lineRule="auto"/>
-        <w:ind w:left="0" w:firstLine="720"/>
-        <w:jc w:val="both"/>
-        <w:rPr>
-          <w:rFonts w:ascii="Times New Roman" w:cs="Times New Roman" w:eastAsia="Times New Roman" w:hAnsi="Times New Roman"/>
-          <w:sz w:val="26"/>
-          <w:szCs w:val="26"/>
-        </w:rPr>
-      </w:pPr>
-      <w:r>
-        <w:rPr>
-          <w:rFonts w:ascii="Times New Roman" w:cs="Times New Roman" w:eastAsia="Times New Roman" w:hAnsi="Times New Roman"/>
-          <w:sz w:val="26"/>
-          <w:szCs w:val="26"/>
-          <w:rtl w:val="0"/>
-        </w:rPr>
-        <w:t xml:space="preserve">The class diagram for the controller package defines the core game logic and audio management of the system, primarily driven by the GameEngine and SoundController classes. GameEngine acts as the central controller of the gameplay loop, managing essential state attributes such as score, isGameOver, and isPaused. It relies on external Java components, utilizing java.util.Random for generating randomized game pieces, javax.swing.Timer for driving game ticks, and a java.lang.Runnable object named viewUpdater to invoke notifyView() and refresh the User Interface. Furthermore, GameEngine maintains a direct association with SoundController, allowing it to trigger contextual audio events during gameplay. The SoundController class encapsulates the audio subsystem, managing toggle states for background music (bgmMuted) and sound effects (sfxMuted) while providing public methods like playBGM() and playSFX() to play audio files from specified resource paths. Regarding method implementations, the GameEngine encapsulates complex state transitions through several critical routines. The gameLoop() method serves as the center of the game, continuously updating the state. Movement and positioning are handled by  methods such as movePieceDown(), moveLeft(), moveRight(), softDrop(), and rotateCurrentPiece(), which validate and update coordinates. When a piece can no longer move, lockCurrentPieceAndContinue() is invoked to secure its position on the board, followed by calculateScore(linesCleared: int) to compute and update the player's current score based on the scoreMultiplier. Additionally, methods like togglePause(), start(), and stop() provide robust control over the execution state of the game loop, ensuring smooth and predictable application control.</w:t>
-      </w:r>
-    </w:p>
-    <w:p>
-      <w:pPr>
-        <w:spacing w:after="160" w:lineRule="auto"/>
-        <w:ind w:left="720" w:firstLine="0"/>
-        <w:jc w:val="both"/>
-        <w:rPr>
-          <w:rFonts w:ascii="Times New Roman" w:cs="Times New Roman" w:eastAsia="Times New Roman" w:hAnsi="Times New Roman"/>
-          <w:sz w:val="26"/>
-          <w:szCs w:val="26"/>
-        </w:rPr>
-      </w:pPr>
-      <w:r>
-        <w:rPr>
-          <w:rtl w:val="0"/>
-        </w:rPr>
-      </w:r>
-    </w:p>
-    <w:p>
-      <w:pPr>
-        <w:ind w:left="425.19685039370086" w:firstLine="0"/>
+        <w:ind w:firstLine="720"/>
         <w:jc w:val="both"/>
         <w:rPr>
           <w:rFonts w:ascii="Times New Roman" w:cs="Times New Roman" w:eastAsia="Times New Roman" w:hAnsi="Times New Roman"/>
@@ -4072,6 +4523,15 @@
           <w:szCs w:val="26"/>
         </w:rPr>
       </w:pPr>
+      <w:r>
+        <w:rPr>
+          <w:rFonts w:ascii="Times New Roman" w:cs="Times New Roman" w:eastAsia="Times New Roman" w:hAnsi="Times New Roman"/>
+          <w:sz w:val="26"/>
+          <w:szCs w:val="26"/>
+          <w:rtl w:val="0"/>
+        </w:rPr>
+        <w:t xml:space="preserve">The controller package encapsulates the system’s operational logic, gameplay flow, and auxiliary control services. Its primary responsibility is to interpret user commands, update the model accordingly, and coordinate view refreshes. The GameEngine class serves as the central controller and orchestrates the entire gameplay lifecycle. It maintains critical state variables such as the current score, pause status, and game-over condition. Game progression is driven by a javax.swing.Timer, which triggers periodic updates to advance the falling Tetromino at an interval determined by the selected difficulty level.nThe engine encapsulates all gameplay operations, including horizontal movement and vertical descent, rotation validation and execution, soft drop and hard drop mechanics , piece locking, line clearing, and new piece spawning , score calculation with difficulty-based multipliers ,upon any state change, the engine invokes a view-update callback, prompting the graphical interface to repaint without granting the view direct access to game logic. Audio management is handled by the SoundController class, which operates independently of gameplay logic. It manages background music and sound effects using Java’s audio facilities, maintaining separate mute states and exposing simple control methods. The GameEngine interacts with this component to trigger sound effects contextually, such as during line-clearing events, without embedding audio logic directly within gameplay routines.</w:t>
+      </w:r>
       <w:r>
         <w:rPr>
           <w:rtl w:val="0"/>
@@ -4129,14 +4589,14 @@
         </w:rPr>
         <w:drawing>
           <wp:inline distB="114300" distT="114300" distL="114300" distR="114300">
-            <wp:extent cx="6529225" cy="3696008"/>
+            <wp:extent cx="5943600" cy="4711700"/>
             <wp:effectExtent b="0" l="0" r="0" t="0"/>
-            <wp:docPr id="2" name="image1.png"/>
+            <wp:docPr id="3" name="image2.png"/>
             <a:graphic>
               <a:graphicData uri="http://schemas.openxmlformats.org/drawingml/2006/picture">
                 <pic:pic>
                   <pic:nvPicPr>
-                    <pic:cNvPr id="0" name="image1.png"/>
+                    <pic:cNvPr id="0" name="image2.png"/>
                     <pic:cNvPicPr preferRelativeResize="0"/>
                   </pic:nvPicPr>
                   <pic:blipFill>
@@ -4149,7 +4609,7 @@
                   <pic:spPr>
                     <a:xfrm>
                       <a:off x="0" y="0"/>
-                      <a:ext cx="6529225" cy="3696008"/>
+                      <a:ext cx="5943600" cy="4711700"/>
                     </a:xfrm>
                     <a:prstGeom prst="rect"/>
                     <a:ln/>
@@ -4239,67 +4699,8 @@
           <w:szCs w:val="26"/>
           <w:rtl w:val="0"/>
         </w:rPr>
-        <w:t xml:space="preserve">The class diagram for the model package encapsulates the core data structures and state representation of the Tetris game, structured around a grid-based board and piece management. The Board class defines the playing field with fixed dimensions of 20 rows (ROWS) and 10 columns (COLS), maintaining a 2D grid matrix representation via the java.awt.Color package. The game pieces are managed through an object-oriented hierarchy centered on the Tetromino class, which holds a composite relationship with the Cell class, which serves as the atomic primitive, tracking individual grid positions using x and y coordinate attributes along with their specific Color. To implement the diverse set of Tetris blocks, seven distinct subclasses—ZShape, JShape, TShape, LShape, SquareShape, SShape, and StraightShape—inherit directly from the base Tetromino class. In terms of method implementations, the Board class manages spatial validation and grid modification. It exposes isValidBlock(piece: Tetromino, dx: int, dy: int) to perform collision detection, lockPiece(piece: Tetromino) to permanently bind a fallen piece to the grid, and clearLines() to scan, clear completed rows, and collapse the grid down. Movement mechanics are delegated to the Tetromino class, which offers the move(dx: int, dy: int) method to alter position coordinates uniformly. To handle spatial orientation, the abstract or base Tetromino defines rotate() and rotateBack() routines. Each specialized shape subclass overrides these two rotation methods to execute shape-specific coordinate transformations, ensuring proper geometric behavior and wall-kick restorations when rotations are cancelled.</w:t>
-      </w:r>
-    </w:p>
-    <w:p>
-      <w:pPr>
-        <w:spacing w:after="160" w:lineRule="auto"/>
-        <w:jc w:val="both"/>
-        <w:rPr>
-          <w:rFonts w:ascii="Times New Roman" w:cs="Times New Roman" w:eastAsia="Times New Roman" w:hAnsi="Times New Roman"/>
-          <w:b w:val="1"/>
-          <w:bCs w:val="1"/>
-          <w:sz w:val="26"/>
-          <w:szCs w:val="26"/>
-        </w:rPr>
-      </w:pPr>
-      <w:r>
-        <w:rPr>
-          <w:rFonts w:ascii="Times New Roman" w:cs="Times New Roman" w:eastAsia="Times New Roman" w:hAnsi="Times New Roman"/>
-          <w:b w:val="1"/>
-          <w:bCs w:val="1"/>
-          <w:sz w:val="26"/>
-          <w:szCs w:val="26"/>
-          <w:rtl w:val="0"/>
-        </w:rPr>
-        <w:t xml:space="preserve"> </w:t>
-      </w:r>
-    </w:p>
-    <w:p>
-      <w:pPr>
-        <w:spacing w:after="160" w:lineRule="auto"/>
-        <w:jc w:val="both"/>
-        <w:rPr>
-          <w:rFonts w:ascii="Times New Roman" w:cs="Times New Roman" w:eastAsia="Times New Roman" w:hAnsi="Times New Roman"/>
-          <w:b w:val="1"/>
-          <w:bCs w:val="1"/>
-          <w:sz w:val="26"/>
-          <w:szCs w:val="26"/>
-        </w:rPr>
-      </w:pPr>
-      <w:r>
-        <w:rPr>
-          <w:rFonts w:ascii="Times New Roman" w:cs="Times New Roman" w:eastAsia="Times New Roman" w:hAnsi="Times New Roman"/>
-          <w:b w:val="1"/>
-          <w:bCs w:val="1"/>
-          <w:sz w:val="26"/>
-          <w:szCs w:val="26"/>
-          <w:rtl w:val="0"/>
-        </w:rPr>
-        <w:t xml:space="preserve"> </w:t>
-      </w:r>
-    </w:p>
-    <w:p>
-      <w:pPr>
-        <w:ind w:left="0" w:firstLine="0"/>
-        <w:jc w:val="both"/>
-        <w:rPr>
-          <w:rFonts w:ascii="Times New Roman" w:cs="Times New Roman" w:eastAsia="Times New Roman" w:hAnsi="Times New Roman"/>
-          <w:sz w:val="26"/>
-          <w:szCs w:val="26"/>
-        </w:rPr>
-      </w:pPr>
+        <w:t xml:space="preserve">The model package isolates the pristine data structures and state variables of the application. The system's overarching state is aggregated within the GameState class, which consolidates references to the Board, the currentPiece, the cumulative score, and systemic boolean flags such as isGameOver and isPaused.  The playing field is defined by the Board class, which manages a 20x10 static grid represented by a 2D array of java.awt.Color objects (Color[][] grid). The Board exposes vital structural algorithms, including isValidBlock() for rigorous collision detection and clearLines() for array shifting, nullification, and row elimination.  Game pieces are governed by the abstract Tetromino class, which maintains a composite relationship with an array of four Cell primitives. Each Cell independently tracks its geometric x and y coordinates alongside its assigned rendering color. Seven concrete subclasses (e.g., ZShape, TShape, StraightShape) inherit from Tetromino. Each subclass strictly overrides the abstract rotate() and rotateBack() methods to apply shape-specific linear transformations relative to a defined pivot cell, mathematically achieving the correct geometric orientations.</w:t>
+      </w:r>
       <w:r>
         <w:rPr>
           <w:rtl w:val="0"/>
@@ -4978,6 +5379,116 @@
     </w:lvl>
   </w:abstractNum>
   <w:abstractNum w:abstractNumId="7">
+    <w:lvl w:ilvl="0">
+      <w:start w:val="1"/>
+      <w:numFmt w:val="bullet"/>
+      <w:lvlText w:val="●"/>
+      <w:lvlJc w:val="left"/>
+      <w:pPr>
+        <w:ind w:left="720" w:hanging="360"/>
+      </w:pPr>
+      <w:rPr>
+        <w:u w:val="none"/>
+      </w:rPr>
+    </w:lvl>
+    <w:lvl w:ilvl="1">
+      <w:start w:val="1"/>
+      <w:numFmt w:val="bullet"/>
+      <w:lvlText w:val="○"/>
+      <w:lvlJc w:val="left"/>
+      <w:pPr>
+        <w:ind w:left="1440" w:hanging="360"/>
+      </w:pPr>
+      <w:rPr>
+        <w:u w:val="none"/>
+      </w:rPr>
+    </w:lvl>
+    <w:lvl w:ilvl="2">
+      <w:start w:val="1"/>
+      <w:numFmt w:val="bullet"/>
+      <w:lvlText w:val="■"/>
+      <w:lvlJc w:val="left"/>
+      <w:pPr>
+        <w:ind w:left="2160" w:hanging="360"/>
+      </w:pPr>
+      <w:rPr>
+        <w:u w:val="none"/>
+      </w:rPr>
+    </w:lvl>
+    <w:lvl w:ilvl="3">
+      <w:start w:val="1"/>
+      <w:numFmt w:val="bullet"/>
+      <w:lvlText w:val="●"/>
+      <w:lvlJc w:val="left"/>
+      <w:pPr>
+        <w:ind w:left="2880" w:hanging="360"/>
+      </w:pPr>
+      <w:rPr>
+        <w:u w:val="none"/>
+      </w:rPr>
+    </w:lvl>
+    <w:lvl w:ilvl="4">
+      <w:start w:val="1"/>
+      <w:numFmt w:val="bullet"/>
+      <w:lvlText w:val="○"/>
+      <w:lvlJc w:val="left"/>
+      <w:pPr>
+        <w:ind w:left="3600" w:hanging="360"/>
+      </w:pPr>
+      <w:rPr>
+        <w:u w:val="none"/>
+      </w:rPr>
+    </w:lvl>
+    <w:lvl w:ilvl="5">
+      <w:start w:val="1"/>
+      <w:numFmt w:val="bullet"/>
+      <w:lvlText w:val="■"/>
+      <w:lvlJc w:val="left"/>
+      <w:pPr>
+        <w:ind w:left="4320" w:hanging="360"/>
+      </w:pPr>
+      <w:rPr>
+        <w:u w:val="none"/>
+      </w:rPr>
+    </w:lvl>
+    <w:lvl w:ilvl="6">
+      <w:start w:val="1"/>
+      <w:numFmt w:val="bullet"/>
+      <w:lvlText w:val="●"/>
+      <w:lvlJc w:val="left"/>
+      <w:pPr>
+        <w:ind w:left="5040" w:hanging="360"/>
+      </w:pPr>
+      <w:rPr>
+        <w:u w:val="none"/>
+      </w:rPr>
+    </w:lvl>
+    <w:lvl w:ilvl="7">
+      <w:start w:val="1"/>
+      <w:numFmt w:val="bullet"/>
+      <w:lvlText w:val="○"/>
+      <w:lvlJc w:val="left"/>
+      <w:pPr>
+        <w:ind w:left="5760" w:hanging="360"/>
+      </w:pPr>
+      <w:rPr>
+        <w:u w:val="none"/>
+      </w:rPr>
+    </w:lvl>
+    <w:lvl w:ilvl="8">
+      <w:start w:val="1"/>
+      <w:numFmt w:val="bullet"/>
+      <w:lvlText w:val="■"/>
+      <w:lvlJc w:val="left"/>
+      <w:pPr>
+        <w:ind w:left="6480" w:hanging="360"/>
+      </w:pPr>
+      <w:rPr>
+        <w:u w:val="none"/>
+      </w:rPr>
+    </w:lvl>
+  </w:abstractNum>
+  <w:abstractNum w:abstractNumId="8">
     <w:lvl w:ilvl="0">
       <w:start w:val="1"/>
       <w:numFmt w:val="bullet"/>
@@ -5107,6 +5618,9 @@
   </w:num>
   <w:num w:numId="7">
     <w:abstractNumId w:val="7"/>
+  </w:num>
+  <w:num w:numId="8">
+    <w:abstractNumId w:val="8"/>
   </w:num>
 </w:numbering>
 </file>

</xml_diff>